<commit_message>
PantryChef: update to In Development status in full Word resume
</commit_message>
<xml_diff>
--- a/Antoine_Victor_Resume.docx
+++ b/Antoine_Victor_Resume.docx
@@ -64,7 +64,7 @@
         <w:rPr>
           <w:sz w:val="20"/>
         </w:rPr>
-        <w:t>Technical trainer and curriculum developer with 20+ years of experience delivering high-impact training and innovative course materials. Expert in leveraging Generative AI for rapid content creation, engaging presentations, and transforming technical content into accessible learning experiences. Since 2023, has developed deep expertise in Swift — co-designing courses, authoring the Lab Realism Manifesto, and designing the full-stack PantryChef application as a production lab vehicle, all under contract with BaySide Solutions at Apple. Proficient in MS SQL Server, Agile, DevOps, and Infrastructure Automation, with a strong track record of client and learner success.</w:t>
+        <w:t>Technical trainer and curriculum developer with 20+ years of experience delivering high-impact training and innovative course materials. Expert in leveraging Generative AI for rapid content creation, engaging presentations, and transforming technical content into accessible learning experiences. Since 2023, has developed deep expertise in Swift — co-designing courses, authoring the Lab Realism Manifesto, and designing the PantryChef application as a lab vehicle (currently under development), all under contract with BaySide Solutions at Apple. Proficient in MS SQL Server, Agile, DevOps, and Infrastructure Automation, with a strong track record of client and learner success.</w:t>
       </w:r>
     </w:p>
     <w:p>
@@ -423,7 +423,7 @@
           <w:color w:val="1A1A1A"/>
           <w:sz w:val="20"/>
         </w:rPr>
-        <w:t xml:space="preserve"> — Designed this full-stack Swift app (Vapor 4, SwiftUI, OpenAPI 3.1, Fluent/PostgreSQL, JWT, Amazon Fresh, Docker Compose) as the production lab vehicle for Swift for Server Developers. Students implement RecipeService and PantryService, graduating as open-source contributors.</w:t>
+        <w:t xml:space="preserve"> — Designed this full-stack Swift app (Vapor 4, SwiftUI, OpenAPI 3.1, Fluent/PostgreSQL, JWT, Amazon Fresh, Docker Compose) as the lab vehicle (currently under development) for Swift for Server Developers. Students implement RecipeService and PantryService, graduating as open-source contributors.</w:t>
       </w:r>
       <w:r>
         <w:rPr>
@@ -937,7 +937,7 @@
           <w:color w:val="1A7A1A"/>
           <w:sz w:val="21"/>
         </w:rPr>
-        <w:t>PantryChef — Production Lab Application</w:t>
+        <w:t>PantryChef — Lab Application (In Development)</w:t>
       </w:r>
       <w:r>
         <w:rPr>
@@ -972,7 +972,7 @@
           <w:color w:val="1A1A1A"/>
           <w:sz w:val="20"/>
         </w:rPr>
-        <w:t>Designed end-to-end as the lab vehicle for Swift for Server Developers. Smart recipe management app with pantry tracking, AI-powered recipe matching, and Amazon Fresh integration. Pre-built: JWT auth, PostgreSQL schema, Vapor app shell, OpenAPI spec, Swift-OpenAPI Generator stubs, Leaf frontend, SwiftUI iOS app.</w:t>
+        <w:t>Designed end-to-end as the lab vehicle for Swift for Server Developers (currently under development). Smart recipe management app with pantry tracking, AI-powered recipe matching, and Amazon Fresh integration. Pre-built: JWT auth, PostgreSQL schema, Vapor app shell, OpenAPI spec, Swift-OpenAPI Generator stubs, Leaf frontend, SwiftUI iOS app.</w:t>
       </w:r>
     </w:p>
     <w:p>
@@ -1325,7 +1325,7 @@
           <w:color w:val="1A1A1A"/>
           <w:sz w:val="20"/>
         </w:rPr>
-        <w:t>full-stack Swift production app (Vapor, SwiftUI, OpenAPI, Fluent/PostgreSQL, Docker) as the lab vehicle where students contribute real code to a live open-source codebase.</w:t>
+        <w:t>full-stack Swift lab app (Vapor, SwiftUI, OpenAPI, Fluent/PostgreSQL, Docker) currently under development as the lab vehicle for Swift for Server Developers.</w:t>
       </w:r>
       <w:r>
         <w:rPr>

</xml_diff>

<commit_message>
Remove Go from languages
</commit_message>
<xml_diff>
--- a/Antoine_Victor_Resume.docx
+++ b/Antoine_Victor_Resume.docx
@@ -923,7 +923,7 @@
           <w:color w:val="1A1A1A"/>
           <w:sz w:val="20"/>
         </w:rPr>
-        <w:t>Co-designed server-focused Swift onboarding for backend engineers (Python, Java, Go, JS). All labs build progressively on the PantryChef application — Swift essentials, TDD, control flow, protocol-oriented architecture, actor-based concurrency, generic repositories, and async error handling.</w:t>
+        <w:t>Co-designed server-focused Swift onboarding for backend engineers (Python, Java, JS). All labs build progressively on the PantryChef application — Swift essentials, TDD, control flow, protocol-oriented architecture, actor-based concurrency, generic repositories, and async error handling.</w:t>
       </w:r>
     </w:p>
     <w:p>
@@ -1597,7 +1597,7 @@
           <w:color w:val="1A1A1A"/>
           <w:sz w:val="20"/>
         </w:rPr>
-        <w:t>Swift (2023 → Advanced, server-side focus), SQL, C#, Java, Go</w:t>
+        <w:t>Swift (2023 → Advanced, server-side focus), SQL, C#, Java</w:t>
       </w:r>
     </w:p>
     <w:p>

</xml_diff>